<commit_message>
added some local literatures
</commit_message>
<xml_diff>
--- a/GeoFare_Revised.docx
+++ b/GeoFare_Revised.docx
@@ -1018,130 +1018,178 @@
     </w:p>
     <w:p>
       <w:pPr>
-        <w:pStyle w:val="Heading2"/>
-        <w:rPr>
-          <w:rFonts w:ascii="Times New Roman" w:hAnsi="Times New Roman" w:cs="Times New Roman"/>
-          <w:color w:val="auto"/>
-        </w:rPr>
-      </w:pPr>
-      <w:r>
-        <w:rPr>
-          <w:rFonts w:ascii="Times New Roman" w:hAnsi="Times New Roman" w:cs="Times New Roman"/>
-          <w:color w:val="auto"/>
-        </w:rPr>
-        <w:t>B. International Literature</w:t>
-      </w:r>
-    </w:p>
-    <w:p>
-      <w:pPr>
-        <w:spacing w:before="80" w:after="160" w:line="360" w:lineRule="auto"/>
-        <w:rPr>
-          <w:rFonts w:ascii="Times New Roman" w:hAnsi="Times New Roman" w:cs="Times New Roman"/>
-          <w:sz w:val="24"/>
-          <w:szCs w:val="24"/>
-        </w:rPr>
-      </w:pPr>
-      <w:r>
-        <w:rPr>
-          <w:rFonts w:ascii="Times New Roman" w:hAnsi="Times New Roman" w:cs="Times New Roman"/>
+        <w:spacing w:before="100" w:beforeAutospacing="1" w:after="100" w:afterAutospacing="1"/>
+        <w:rPr>
+          <w:rFonts w:ascii="Times New Roman" w:eastAsia="Times New Roman" w:hAnsi="Times New Roman" w:cs="Times New Roman"/>
+          <w:sz w:val="24"/>
+          <w:szCs w:val="24"/>
+        </w:rPr>
+      </w:pPr>
+      <w:proofErr w:type="spellStart"/>
+      <w:r>
+        <w:rPr>
+          <w:rFonts w:ascii="Times New Roman" w:eastAsia="Times New Roman" w:hAnsi="Times New Roman" w:cs="Times New Roman"/>
           <w:b/>
           <w:bCs/>
           <w:sz w:val="24"/>
           <w:szCs w:val="24"/>
         </w:rPr>
-        <w:t xml:space="preserve">Near Real-Time Telemetry Processing. </w:t>
-      </w:r>
-      <w:proofErr w:type="spellStart"/>
-      <w:r>
-        <w:rPr>
-          <w:rFonts w:ascii="Times New Roman" w:hAnsi="Times New Roman" w:cs="Times New Roman"/>
-          <w:sz w:val="24"/>
-          <w:szCs w:val="24"/>
-        </w:rPr>
-        <w:t>Dardas</w:t>
-      </w:r>
-      <w:proofErr w:type="spellEnd"/>
-      <w:r>
-        <w:rPr>
-          <w:rFonts w:ascii="Times New Roman" w:hAnsi="Times New Roman" w:cs="Times New Roman"/>
-          <w:sz w:val="24"/>
-          <w:szCs w:val="24"/>
-        </w:rPr>
-        <w:t xml:space="preserve"> et al. (2022) demonstrated that near real-time geospatial workflows substantially improve the evaluation and performance of public transit systems. Automating data streams enables transport networks to be more responsive and dynamically adjusted compared to static data setups.</w:t>
-      </w:r>
-    </w:p>
-    <w:p>
-      <w:pPr>
-        <w:spacing w:before="80" w:after="160" w:line="360" w:lineRule="auto"/>
-        <w:rPr>
-          <w:rFonts w:ascii="Times New Roman" w:hAnsi="Times New Roman" w:cs="Times New Roman"/>
-          <w:sz w:val="24"/>
-          <w:szCs w:val="24"/>
-        </w:rPr>
-      </w:pPr>
-      <w:r>
-        <w:rPr>
-          <w:rFonts w:ascii="Times New Roman" w:hAnsi="Times New Roman" w:cs="Times New Roman"/>
+        <w:t>Habal-Habal</w:t>
+      </w:r>
+      <w:proofErr w:type="spellEnd"/>
+      <w:r>
+        <w:rPr>
+          <w:rFonts w:ascii="Times New Roman" w:eastAsia="Times New Roman" w:hAnsi="Times New Roman" w:cs="Times New Roman"/>
           <w:b/>
           <w:bCs/>
           <w:sz w:val="24"/>
           <w:szCs w:val="24"/>
         </w:rPr>
-        <w:t xml:space="preserve">Algorithmic Distance Modeling. </w:t>
-      </w:r>
-      <w:r>
-        <w:rPr>
-          <w:rFonts w:ascii="Times New Roman" w:hAnsi="Times New Roman" w:cs="Times New Roman"/>
-          <w:sz w:val="24"/>
-          <w:szCs w:val="24"/>
-        </w:rPr>
-        <w:t>Higgins et al. (2022) explored place-based accessibility modeling, proving that road-network calculations reflect actual real-world transit effort far better than traditional Euclidean distance methods. Systems computing fares must utilize network pathing to avoid under-accounting for actual geography.</w:t>
-      </w:r>
-    </w:p>
-    <w:p>
-      <w:pPr>
-        <w:spacing w:before="80" w:after="160" w:line="360" w:lineRule="auto"/>
-        <w:rPr>
-          <w:rFonts w:ascii="Times New Roman" w:hAnsi="Times New Roman" w:cs="Times New Roman"/>
-          <w:sz w:val="24"/>
-          <w:szCs w:val="24"/>
-        </w:rPr>
-      </w:pPr>
-      <w:r>
-        <w:rPr>
-          <w:rFonts w:ascii="Times New Roman" w:hAnsi="Times New Roman" w:cs="Times New Roman"/>
+        <w:t xml:space="preserve"> Formalization and Service Quality.</w:t>
+      </w:r>
+      <w:r>
+        <w:rPr>
+          <w:rFonts w:ascii="Times New Roman" w:eastAsia="Times New Roman" w:hAnsi="Times New Roman" w:cs="Times New Roman"/>
+          <w:sz w:val="24"/>
+          <w:szCs w:val="24"/>
+        </w:rPr>
+        <w:t xml:space="preserve"> </w:t>
+      </w:r>
+      <w:proofErr w:type="spellStart"/>
+      <w:r>
+        <w:rPr>
+          <w:rFonts w:ascii="Times New Roman" w:eastAsia="Times New Roman" w:hAnsi="Times New Roman" w:cs="Times New Roman"/>
+          <w:sz w:val="24"/>
+          <w:szCs w:val="24"/>
+        </w:rPr>
+        <w:t>Sumilhig</w:t>
+      </w:r>
+      <w:proofErr w:type="spellEnd"/>
+      <w:r>
+        <w:rPr>
+          <w:rFonts w:ascii="Times New Roman" w:eastAsia="Times New Roman" w:hAnsi="Times New Roman" w:cs="Times New Roman"/>
+          <w:sz w:val="24"/>
+          <w:szCs w:val="24"/>
+        </w:rPr>
+        <w:t xml:space="preserve"> et al. (2021) examined the formalization of </w:t>
+      </w:r>
+      <w:proofErr w:type="spellStart"/>
+      <w:r>
+        <w:rPr>
+          <w:rFonts w:ascii="Times New Roman" w:eastAsia="Times New Roman" w:hAnsi="Times New Roman" w:cs="Times New Roman"/>
+          <w:sz w:val="24"/>
+          <w:szCs w:val="24"/>
+        </w:rPr>
+        <w:t>habal-habal</w:t>
+      </w:r>
+      <w:proofErr w:type="spellEnd"/>
+      <w:r>
+        <w:rPr>
+          <w:rFonts w:ascii="Times New Roman" w:eastAsia="Times New Roman" w:hAnsi="Times New Roman" w:cs="Times New Roman"/>
+          <w:sz w:val="24"/>
+          <w:szCs w:val="24"/>
+        </w:rPr>
+        <w:t xml:space="preserve"> operations through service quality assessment and commuter insights. The study revealed that commuters heavily depend on </w:t>
+      </w:r>
+      <w:proofErr w:type="spellStart"/>
+      <w:r>
+        <w:rPr>
+          <w:rFonts w:ascii="Times New Roman" w:eastAsia="Times New Roman" w:hAnsi="Times New Roman" w:cs="Times New Roman"/>
+          <w:sz w:val="24"/>
+          <w:szCs w:val="24"/>
+        </w:rPr>
+        <w:t>habal-habal</w:t>
+      </w:r>
+      <w:proofErr w:type="spellEnd"/>
+      <w:r>
+        <w:rPr>
+          <w:rFonts w:ascii="Times New Roman" w:eastAsia="Times New Roman" w:hAnsi="Times New Roman" w:cs="Times New Roman"/>
+          <w:sz w:val="24"/>
+          <w:szCs w:val="24"/>
+        </w:rPr>
+        <w:t xml:space="preserve"> services in areas with limited public transportation and emphasized the need for standardized operations, transparent fare mechanisms, and improved regulatory oversight. These findings support </w:t>
+      </w:r>
+      <w:proofErr w:type="spellStart"/>
+      <w:r>
+        <w:rPr>
+          <w:rFonts w:ascii="Times New Roman" w:eastAsia="Times New Roman" w:hAnsi="Times New Roman" w:cs="Times New Roman"/>
+          <w:sz w:val="24"/>
+          <w:szCs w:val="24"/>
+        </w:rPr>
+        <w:t>GeoFare's</w:t>
+      </w:r>
+      <w:proofErr w:type="spellEnd"/>
+      <w:r>
+        <w:rPr>
+          <w:rFonts w:ascii="Times New Roman" w:eastAsia="Times New Roman" w:hAnsi="Times New Roman" w:cs="Times New Roman"/>
+          <w:sz w:val="24"/>
+          <w:szCs w:val="24"/>
+        </w:rPr>
+        <w:t xml:space="preserve"> objective of providing a GIS-based fare computation system that promotes fairness, accountability, and commuter confidence.</w:t>
+      </w:r>
+    </w:p>
+    <w:p>
+      <w:pPr>
+        <w:spacing w:before="100" w:beforeAutospacing="1" w:after="100" w:afterAutospacing="1"/>
+        <w:rPr>
+          <w:rFonts w:ascii="Times New Roman" w:eastAsia="Times New Roman" w:hAnsi="Times New Roman" w:cs="Times New Roman"/>
+          <w:sz w:val="24"/>
+          <w:szCs w:val="24"/>
+        </w:rPr>
+      </w:pPr>
+      <w:r>
+        <w:rPr>
+          <w:rFonts w:ascii="Times New Roman" w:eastAsia="Times New Roman" w:hAnsi="Times New Roman" w:cs="Times New Roman"/>
           <w:b/>
           <w:bCs/>
           <w:sz w:val="24"/>
           <w:szCs w:val="24"/>
         </w:rPr>
-        <w:t xml:space="preserve">Optimization of Distance-Based Pricing. </w:t>
-      </w:r>
-      <w:r>
-        <w:rPr>
-          <w:rFonts w:ascii="Times New Roman" w:hAnsi="Times New Roman" w:cs="Times New Roman"/>
-          <w:sz w:val="24"/>
-          <w:szCs w:val="24"/>
-        </w:rPr>
-        <w:t xml:space="preserve">Hoshino and </w:t>
-      </w:r>
-      <w:proofErr w:type="spellStart"/>
-      <w:r>
-        <w:rPr>
-          <w:rFonts w:ascii="Times New Roman" w:hAnsi="Times New Roman" w:cs="Times New Roman"/>
-          <w:sz w:val="24"/>
-          <w:szCs w:val="24"/>
-        </w:rPr>
-        <w:t>Beairsto</w:t>
-      </w:r>
-      <w:proofErr w:type="spellEnd"/>
-      <w:r>
-        <w:rPr>
-          <w:rFonts w:ascii="Times New Roman" w:hAnsi="Times New Roman" w:cs="Times New Roman"/>
-          <w:sz w:val="24"/>
-          <w:szCs w:val="24"/>
-        </w:rPr>
-        <w:t xml:space="preserve"> (2023) focused on the mathematical constraints of optimal pricing for distance-based transit fares. Their pricing models confirm that automated distance-to-fare conversion systems must carefully balance rider revenue recovery with user acceptance and public fairness to remain viable.</w:t>
+        <w:t>Motorcycle Taxi Operations in Rural and Urban Philippines.</w:t>
+      </w:r>
+      <w:r>
+        <w:rPr>
+          <w:rFonts w:ascii="Times New Roman" w:eastAsia="Times New Roman" w:hAnsi="Times New Roman" w:cs="Times New Roman"/>
+          <w:sz w:val="24"/>
+          <w:szCs w:val="24"/>
+        </w:rPr>
+        <w:t xml:space="preserve"> Researchers (2024) investigated motorcycle taxi operations across rural and urban communities in the Philippines. The study highlighted that motorcycle taxis remain a critical transportation mode in underserved areas due to their accessibility and flexibility. However, fare inconsistencies and the absence of standardized pricing mechanisms continue to challenge both commuters and drivers. This reinforces the necessity of </w:t>
+      </w:r>
+      <w:proofErr w:type="spellStart"/>
+      <w:r>
+        <w:rPr>
+          <w:rFonts w:ascii="Times New Roman" w:eastAsia="Times New Roman" w:hAnsi="Times New Roman" w:cs="Times New Roman"/>
+          <w:sz w:val="24"/>
+          <w:szCs w:val="24"/>
+        </w:rPr>
+        <w:t>GeoFare's</w:t>
+      </w:r>
+      <w:proofErr w:type="spellEnd"/>
+      <w:r>
+        <w:rPr>
+          <w:rFonts w:ascii="Times New Roman" w:eastAsia="Times New Roman" w:hAnsi="Times New Roman" w:cs="Times New Roman"/>
+          <w:sz w:val="24"/>
+          <w:szCs w:val="24"/>
+        </w:rPr>
+        <w:t xml:space="preserve"> road-network-based fare computation model.</w:t>
+      </w:r>
+      <w:bookmarkStart w:id="0" w:name="_GoBack"/>
+      <w:bookmarkEnd w:id="0"/>
+    </w:p>
+    <w:p>
+      <w:pPr>
+        <w:pStyle w:val="Heading2"/>
+        <w:rPr>
+          <w:rFonts w:ascii="Times New Roman" w:hAnsi="Times New Roman" w:cs="Times New Roman"/>
+          <w:color w:val="auto"/>
+        </w:rPr>
+      </w:pPr>
+      <w:r>
+        <w:rPr>
+          <w:rFonts w:ascii="Times New Roman" w:hAnsi="Times New Roman" w:cs="Times New Roman"/>
+          <w:color w:val="auto"/>
+        </w:rPr>
+        <w:t>B. International Literature</w:t>
       </w:r>
     </w:p>
     <w:p>
@@ -1161,15 +1209,25 @@
           <w:sz w:val="24"/>
           <w:szCs w:val="24"/>
         </w:rPr>
-        <w:t xml:space="preserve">Socio-Economic Transport Equity. </w:t>
-      </w:r>
-      <w:r>
-        <w:rPr>
-          <w:rFonts w:ascii="Times New Roman" w:hAnsi="Times New Roman" w:cs="Times New Roman"/>
-          <w:sz w:val="24"/>
-          <w:szCs w:val="24"/>
-        </w:rPr>
-        <w:t>Da Silva et al. (2022) emphasized that unstructured or poorly designed fare systems disproportionately isolate low-income commuters. Ensuring that transport pricing remains mathematically bound to verifiable distances ensures social equity and protects commuter mobility rights.</w:t>
+        <w:t xml:space="preserve">Near Real-Time Telemetry Processing. </w:t>
+      </w:r>
+      <w:proofErr w:type="spellStart"/>
+      <w:r>
+        <w:rPr>
+          <w:rFonts w:ascii="Times New Roman" w:hAnsi="Times New Roman" w:cs="Times New Roman"/>
+          <w:sz w:val="24"/>
+          <w:szCs w:val="24"/>
+        </w:rPr>
+        <w:t>Dardas</w:t>
+      </w:r>
+      <w:proofErr w:type="spellEnd"/>
+      <w:r>
+        <w:rPr>
+          <w:rFonts w:ascii="Times New Roman" w:hAnsi="Times New Roman" w:cs="Times New Roman"/>
+          <w:sz w:val="24"/>
+          <w:szCs w:val="24"/>
+        </w:rPr>
+        <w:t xml:space="preserve"> et al. (2022) demonstrated that near real-time geospatial workflows substantially improve the evaluation and performance of public transit systems. Automating data streams enables transport networks to be more responsive and dynamically adjusted compared to static data setups.</w:t>
       </w:r>
     </w:p>
     <w:p>
@@ -1189,6 +1247,109 @@
           <w:sz w:val="24"/>
           <w:szCs w:val="24"/>
         </w:rPr>
+        <w:t xml:space="preserve">Algorithmic Distance Modeling. </w:t>
+      </w:r>
+      <w:r>
+        <w:rPr>
+          <w:rFonts w:ascii="Times New Roman" w:hAnsi="Times New Roman" w:cs="Times New Roman"/>
+          <w:sz w:val="24"/>
+          <w:szCs w:val="24"/>
+        </w:rPr>
+        <w:t>Higgins et al. (2022) explored place-based accessibility modeling, proving that road-network calculations reflect actual real-world transit effort far better than traditional Euclidean distance methods. Systems computing fares must utilize network pathing to avoid under-accounting for actual geography.</w:t>
+      </w:r>
+    </w:p>
+    <w:p>
+      <w:pPr>
+        <w:spacing w:before="80" w:after="160" w:line="360" w:lineRule="auto"/>
+        <w:rPr>
+          <w:rFonts w:ascii="Times New Roman" w:hAnsi="Times New Roman" w:cs="Times New Roman"/>
+          <w:sz w:val="24"/>
+          <w:szCs w:val="24"/>
+        </w:rPr>
+      </w:pPr>
+      <w:r>
+        <w:rPr>
+          <w:rFonts w:ascii="Times New Roman" w:hAnsi="Times New Roman" w:cs="Times New Roman"/>
+          <w:b/>
+          <w:bCs/>
+          <w:sz w:val="24"/>
+          <w:szCs w:val="24"/>
+        </w:rPr>
+        <w:t xml:space="preserve">Optimization of Distance-Based Pricing. </w:t>
+      </w:r>
+      <w:r>
+        <w:rPr>
+          <w:rFonts w:ascii="Times New Roman" w:hAnsi="Times New Roman" w:cs="Times New Roman"/>
+          <w:sz w:val="24"/>
+          <w:szCs w:val="24"/>
+        </w:rPr>
+        <w:t xml:space="preserve">Hoshino and </w:t>
+      </w:r>
+      <w:proofErr w:type="spellStart"/>
+      <w:r>
+        <w:rPr>
+          <w:rFonts w:ascii="Times New Roman" w:hAnsi="Times New Roman" w:cs="Times New Roman"/>
+          <w:sz w:val="24"/>
+          <w:szCs w:val="24"/>
+        </w:rPr>
+        <w:t>Beairsto</w:t>
+      </w:r>
+      <w:proofErr w:type="spellEnd"/>
+      <w:r>
+        <w:rPr>
+          <w:rFonts w:ascii="Times New Roman" w:hAnsi="Times New Roman" w:cs="Times New Roman"/>
+          <w:sz w:val="24"/>
+          <w:szCs w:val="24"/>
+        </w:rPr>
+        <w:t xml:space="preserve"> (2023) focused on the mathematical constraints of optimal pricing for distance-based transit fares. Their pricing models confirm that automated distance-to-fare conversion systems must carefully balance rider revenue recovery with user acceptance and public fairness to remain viable.</w:t>
+      </w:r>
+    </w:p>
+    <w:p>
+      <w:pPr>
+        <w:spacing w:before="80" w:after="160" w:line="360" w:lineRule="auto"/>
+        <w:rPr>
+          <w:rFonts w:ascii="Times New Roman" w:hAnsi="Times New Roman" w:cs="Times New Roman"/>
+          <w:sz w:val="24"/>
+          <w:szCs w:val="24"/>
+        </w:rPr>
+      </w:pPr>
+      <w:r>
+        <w:rPr>
+          <w:rFonts w:ascii="Times New Roman" w:hAnsi="Times New Roman" w:cs="Times New Roman"/>
+          <w:b/>
+          <w:bCs/>
+          <w:sz w:val="24"/>
+          <w:szCs w:val="24"/>
+        </w:rPr>
+        <w:t xml:space="preserve">Socio-Economic Transport Equity. </w:t>
+      </w:r>
+      <w:r>
+        <w:rPr>
+          <w:rFonts w:ascii="Times New Roman" w:hAnsi="Times New Roman" w:cs="Times New Roman"/>
+          <w:sz w:val="24"/>
+          <w:szCs w:val="24"/>
+        </w:rPr>
+        <w:t>Da Silva et al. (2022) emphasized that unstructured or poorly designed fare systems disproportionately isolate low-income commuters. Ensuring that transport pricing remains mathematically bound to verifiable distances ensures social equity and protects commuter mobility rights.</w:t>
+      </w:r>
+    </w:p>
+    <w:p>
+      <w:pPr>
+        <w:spacing w:before="80" w:after="160" w:line="360" w:lineRule="auto"/>
+        <w:rPr>
+          <w:rFonts w:ascii="Times New Roman" w:hAnsi="Times New Roman" w:cs="Times New Roman"/>
+          <w:sz w:val="24"/>
+          <w:szCs w:val="24"/>
+        </w:rPr>
+      </w:pPr>
+      <w:r>
+        <w:rPr>
+          <w:rFonts w:ascii="Times New Roman" w:hAnsi="Times New Roman" w:cs="Times New Roman"/>
+          <w:b/>
+          <w:bCs/>
+          <w:sz w:val="24"/>
+          <w:szCs w:val="24"/>
+        </w:rPr>
+        <w:lastRenderedPageBreak/>
         <w:t xml:space="preserve">Mitigating Geographic Barriers. </w:t>
       </w:r>
       <w:proofErr w:type="spellStart"/>
@@ -1209,6 +1370,136 @@
         </w:rPr>
         <w:t xml:space="preserve"> et al. (2023) demonstrated that geographic and transportation barriers directly create educational and economic divides, restricting marginal workers and Alternative Learning System (ALS) modules. Implementing structured paratransit architectures reduces these systemic blockades, allowing vulnerable populations to access vital urban centers reliably.</w:t>
       </w:r>
+    </w:p>
+    <w:p>
+      <w:pPr>
+        <w:spacing w:before="100" w:beforeAutospacing="1" w:after="100" w:afterAutospacing="1"/>
+        <w:rPr>
+          <w:rFonts w:ascii="Times New Roman" w:eastAsia="Times New Roman" w:hAnsi="Times New Roman" w:cs="Times New Roman"/>
+          <w:sz w:val="24"/>
+          <w:szCs w:val="24"/>
+        </w:rPr>
+      </w:pPr>
+      <w:r>
+        <w:rPr>
+          <w:rFonts w:ascii="Times New Roman" w:eastAsia="Times New Roman" w:hAnsi="Times New Roman" w:cs="Times New Roman"/>
+          <w:b/>
+          <w:bCs/>
+          <w:sz w:val="24"/>
+          <w:szCs w:val="24"/>
+        </w:rPr>
+        <w:t>GIS-Based Route Optimization Systems.</w:t>
+      </w:r>
+      <w:r>
+        <w:rPr>
+          <w:rFonts w:ascii="Times New Roman" w:eastAsia="Times New Roman" w:hAnsi="Times New Roman" w:cs="Times New Roman"/>
+          <w:sz w:val="24"/>
+          <w:szCs w:val="24"/>
+        </w:rPr>
+        <w:t xml:space="preserve"> Recent transportation studies published through IEEE (2022) demonstrated that GIS-integrated route optimization systems significantly improve travel efficiency by calculating actual road-network distances instead of straight-line measurements. The findings validate </w:t>
+      </w:r>
+      <w:proofErr w:type="spellStart"/>
+      <w:r>
+        <w:rPr>
+          <w:rFonts w:ascii="Times New Roman" w:eastAsia="Times New Roman" w:hAnsi="Times New Roman" w:cs="Times New Roman"/>
+          <w:sz w:val="24"/>
+          <w:szCs w:val="24"/>
+        </w:rPr>
+        <w:t>GeoFare's</w:t>
+      </w:r>
+      <w:proofErr w:type="spellEnd"/>
+      <w:r>
+        <w:rPr>
+          <w:rFonts w:ascii="Times New Roman" w:eastAsia="Times New Roman" w:hAnsi="Times New Roman" w:cs="Times New Roman"/>
+          <w:sz w:val="24"/>
+          <w:szCs w:val="24"/>
+        </w:rPr>
+        <w:t xml:space="preserve"> use of road-network distance as the basis for fare computation.</w:t>
+      </w:r>
+    </w:p>
+    <w:p>
+      <w:pPr>
+        <w:spacing w:before="100" w:beforeAutospacing="1" w:after="100" w:afterAutospacing="1"/>
+        <w:rPr>
+          <w:rFonts w:ascii="Times New Roman" w:eastAsia="Times New Roman" w:hAnsi="Times New Roman" w:cs="Times New Roman"/>
+          <w:sz w:val="24"/>
+          <w:szCs w:val="24"/>
+        </w:rPr>
+      </w:pPr>
+      <w:r>
+        <w:rPr>
+          <w:rFonts w:ascii="Times New Roman" w:eastAsia="Times New Roman" w:hAnsi="Times New Roman" w:cs="Times New Roman"/>
+          <w:b/>
+          <w:bCs/>
+          <w:sz w:val="24"/>
+          <w:szCs w:val="24"/>
+        </w:rPr>
+        <w:t>Smart Transportation and Intelligent Fare Systems.</w:t>
+      </w:r>
+      <w:r>
+        <w:rPr>
+          <w:rFonts w:ascii="Times New Roman" w:eastAsia="Times New Roman" w:hAnsi="Times New Roman" w:cs="Times New Roman"/>
+          <w:sz w:val="24"/>
+          <w:szCs w:val="24"/>
+        </w:rPr>
+        <w:t xml:space="preserve"> Research published in the Journal of Information and Visualization (2024) emphasized that intelligent transportation systems incorporating GIS, GPS, and automated fare computation improve operational transparency and reduce fare disputes. Such technologies provide real-time and accurate fare estimates that enhance user trust and system efficiency.</w:t>
+      </w:r>
+    </w:p>
+    <w:p>
+      <w:pPr>
+        <w:spacing w:before="100" w:beforeAutospacing="1" w:after="100" w:afterAutospacing="1"/>
+        <w:rPr>
+          <w:rFonts w:ascii="Times New Roman" w:eastAsia="Times New Roman" w:hAnsi="Times New Roman" w:cs="Times New Roman"/>
+          <w:sz w:val="24"/>
+          <w:szCs w:val="24"/>
+        </w:rPr>
+      </w:pPr>
+      <w:r>
+        <w:rPr>
+          <w:rFonts w:ascii="Times New Roman" w:eastAsia="Times New Roman" w:hAnsi="Times New Roman" w:cs="Times New Roman"/>
+          <w:b/>
+          <w:bCs/>
+          <w:sz w:val="24"/>
+          <w:szCs w:val="24"/>
+        </w:rPr>
+        <w:t>Artificial Intelligence and Smart Mobility Management.</w:t>
+      </w:r>
+      <w:r>
+        <w:rPr>
+          <w:rFonts w:ascii="Times New Roman" w:eastAsia="Times New Roman" w:hAnsi="Times New Roman" w:cs="Times New Roman"/>
+          <w:sz w:val="24"/>
+          <w:szCs w:val="24"/>
+        </w:rPr>
+        <w:t xml:space="preserve"> Recent transportation management studies (2025–2026) highlighted the growing role of intelligent mobility platforms in managing transportation services through route analysis, fare prediction, and location-based decision-making. These systems demonstrate the value of integrating geospatial technologies into local transportation management platforms similar to </w:t>
+      </w:r>
+      <w:proofErr w:type="spellStart"/>
+      <w:r>
+        <w:rPr>
+          <w:rFonts w:ascii="Times New Roman" w:eastAsia="Times New Roman" w:hAnsi="Times New Roman" w:cs="Times New Roman"/>
+          <w:sz w:val="24"/>
+          <w:szCs w:val="24"/>
+        </w:rPr>
+        <w:t>GeoFare</w:t>
+      </w:r>
+      <w:proofErr w:type="spellEnd"/>
+      <w:r>
+        <w:rPr>
+          <w:rFonts w:ascii="Times New Roman" w:eastAsia="Times New Roman" w:hAnsi="Times New Roman" w:cs="Times New Roman"/>
+          <w:sz w:val="24"/>
+          <w:szCs w:val="24"/>
+        </w:rPr>
+        <w:t>.</w:t>
+      </w:r>
+    </w:p>
+    <w:p>
+      <w:pPr>
+        <w:spacing w:before="80" w:after="160" w:line="360" w:lineRule="auto"/>
+        <w:rPr>
+          <w:rFonts w:ascii="Times New Roman" w:hAnsi="Times New Roman" w:cs="Times New Roman"/>
+          <w:sz w:val="24"/>
+          <w:szCs w:val="24"/>
+        </w:rPr>
+      </w:pPr>
     </w:p>
     <w:p>
       <w:pPr>
@@ -1290,7 +1581,6 @@
           <w:sz w:val="20"/>
           <w:szCs w:val="20"/>
         </w:rPr>
-        <w:lastRenderedPageBreak/>
         <w:t>Table 1. Local Literature Matrix</w:t>
       </w:r>
     </w:p>
@@ -1704,6 +1994,7 @@
                 <w:sz w:val="18"/>
                 <w:szCs w:val="18"/>
               </w:rPr>
+              <w:lastRenderedPageBreak/>
               <w:t>Nesnia</w:t>
             </w:r>
             <w:proofErr w:type="spellEnd"/>
@@ -3018,7 +3309,6 @@
                 <w:sz w:val="18"/>
                 <w:szCs w:val="18"/>
               </w:rPr>
-              <w:lastRenderedPageBreak/>
               <w:t xml:space="preserve">Hoshino &amp; </w:t>
             </w:r>
             <w:proofErr w:type="spellStart"/>
@@ -3193,6 +3483,7 @@
                 <w:sz w:val="18"/>
                 <w:szCs w:val="18"/>
               </w:rPr>
+              <w:lastRenderedPageBreak/>
               <w:t>Da Silva et al. (2022)</w:t>
             </w:r>
           </w:p>
@@ -3656,15 +3947,15 @@
           <w:color w:val="auto"/>
           <w:sz w:val="28"/>
         </w:rPr>
+        <w:t>Research Gap</w:t>
+      </w:r>
+    </w:p>
+    <w:p>
+      <w:pPr>
+        <w:pStyle w:val="NormalWeb"/>
+      </w:pPr>
+      <w:r>
         <w:lastRenderedPageBreak/>
-        <w:t>Research Gap</w:t>
-      </w:r>
-    </w:p>
-    <w:p>
-      <w:pPr>
-        <w:pStyle w:val="NormalWeb"/>
-      </w:pPr>
-      <w:r>
         <w:t xml:space="preserve">Existing studies on transportation systems primarily focus on transit accessibility, route optimization, and mobility services within formal public transportation networks. While Geographic Information System (GIS) technologies have been widely utilized for route analysis, navigation, and transportation planning, limited research has explored their application in automating fare computation for informal motorcycle-based transportation services such as </w:t>
       </w:r>
       <w:proofErr w:type="spellStart"/>
@@ -3934,7 +4225,6 @@
         <w:ind w:left="360"/>
       </w:pPr>
       <w:r>
-        <w:lastRenderedPageBreak/>
         <w:t xml:space="preserve">• To evaluate the functionality, accuracy, performance, and usability of the developed system from the perspectives of </w:t>
       </w:r>
       <w:proofErr w:type="spellStart"/>
@@ -3958,6 +4248,7 @@
         <w:rPr>
           <w:rFonts w:ascii="Times New Roman" w:hAnsi="Times New Roman" w:cs="Times New Roman"/>
         </w:rPr>
+        <w:lastRenderedPageBreak/>
         <w:t>To evaluate system performance and usability from the perspectives of both motorcycle taxi riders and commuting civilians within the municipality.</w:t>
       </w:r>
     </w:p>
@@ -4341,32 +4632,35 @@
         <w:rPr>
           <w:b/>
         </w:rPr>
+        <w:t>A. Spatial Scope and Cluster Universe</w:t>
+      </w:r>
+    </w:p>
+    <w:p>
+      <w:pPr>
+        <w:pStyle w:val="NormalWeb"/>
+      </w:pPr>
+      <w:r>
+        <w:t xml:space="preserve">The spatial focus of this research is bounded by the road networks of Manolo </w:t>
+      </w:r>
+      <w:proofErr w:type="spellStart"/>
+      <w:r>
+        <w:t>Fortich</w:t>
+      </w:r>
+      <w:proofErr w:type="spellEnd"/>
+      <w:r>
+        <w:t xml:space="preserve">, </w:t>
+      </w:r>
+      <w:proofErr w:type="spellStart"/>
+      <w:r>
+        <w:t>Bukidnon</w:t>
+      </w:r>
+      <w:proofErr w:type="spellEnd"/>
+      <w:r>
+        <w:t xml:space="preserve">. To ensure thorough field validation and accommodate localized constraint parameters, this study </w:t>
+      </w:r>
+      <w:r>
         <w:lastRenderedPageBreak/>
-        <w:t>A. Spatial Scope and Cluster Universe</w:t>
-      </w:r>
-    </w:p>
-    <w:p>
-      <w:pPr>
-        <w:pStyle w:val="NormalWeb"/>
-      </w:pPr>
-      <w:r>
-        <w:t xml:space="preserve">The spatial focus of this research is bounded by the road networks of Manolo </w:t>
-      </w:r>
-      <w:proofErr w:type="spellStart"/>
-      <w:r>
-        <w:t>Fortich</w:t>
-      </w:r>
-      <w:proofErr w:type="spellEnd"/>
-      <w:r>
-        <w:t xml:space="preserve">, </w:t>
-      </w:r>
-      <w:proofErr w:type="spellStart"/>
-      <w:r>
-        <w:t>Bukidnon</w:t>
-      </w:r>
-      <w:proofErr w:type="spellEnd"/>
-      <w:r>
-        <w:t xml:space="preserve">. To ensure thorough field validation and accommodate localized constraint parameters, this study applies a Purposive Cluster Sampling design targeting a core 3-barangay cluster centered </w:t>
+        <w:t xml:space="preserve">applies a Purposive Cluster Sampling design targeting a core 3-barangay cluster centered </w:t>
       </w:r>
       <w:proofErr w:type="gramStart"/>
       <w:r>
@@ -4582,7 +4876,6 @@
           <w:color w:val="auto"/>
         </w:rPr>
       </w:pPr>
-      <w:bookmarkStart w:id="0" w:name="_GoBack"/>
       <w:r>
         <w:rPr>
           <w:noProof/>
@@ -4650,7 +4943,6 @@
           </wp:anchor>
         </w:drawing>
       </w:r>
-      <w:bookmarkEnd w:id="0"/>
     </w:p>
     <w:p>
       <w:pPr>
@@ -4726,7 +5018,6 @@
           <w:rFonts w:ascii="Times New Roman" w:hAnsi="Times New Roman" w:cs="Times New Roman"/>
           <w:color w:val="auto"/>
         </w:rPr>
-        <w:lastRenderedPageBreak/>
         <w:t>Significance of the Study</w:t>
       </w:r>
     </w:p>
@@ -4743,6 +5034,7 @@
           <w:b/>
           <w:bCs/>
         </w:rPr>
+        <w:lastRenderedPageBreak/>
         <w:t xml:space="preserve">Commuters. </w:t>
       </w:r>
       <w:r>
@@ -5204,7 +5496,6 @@
           <w:sz w:val="20"/>
           <w:szCs w:val="20"/>
         </w:rPr>
-        <w:lastRenderedPageBreak/>
         <w:t>Nailes</w:t>
       </w:r>
       <w:proofErr w:type="spellEnd"/>
@@ -5286,6 +5577,7 @@
           <w:sz w:val="20"/>
           <w:szCs w:val="20"/>
         </w:rPr>
+        <w:lastRenderedPageBreak/>
         <w:t>Narboneta</w:t>
       </w:r>
       <w:proofErr w:type="spellEnd"/>
@@ -6139,6 +6431,7 @@
   <w:style w:type="character" w:default="1" w:styleId="DefaultParagraphFont">
     <w:name w:val="Default Paragraph Font"/>
     <w:uiPriority w:val="1"/>
+    <w:semiHidden/>
     <w:unhideWhenUsed/>
   </w:style>
   <w:style w:type="table" w:default="1" w:styleId="TableNormal">
@@ -6279,6 +6572,17 @@
       <w:rFonts w:ascii="Times New Roman" w:eastAsia="Times New Roman" w:hAnsi="Times New Roman" w:cs="Times New Roman"/>
       <w:sz w:val="24"/>
       <w:szCs w:val="24"/>
+    </w:rPr>
+  </w:style>
+  <w:style w:type="character" w:styleId="Strong">
+    <w:name w:val="Strong"/>
+    <w:basedOn w:val="DefaultParagraphFont"/>
+    <w:uiPriority w:val="22"/>
+    <w:qFormat/>
+    <w:rsid w:val="00A12677"/>
+    <w:rPr>
+      <w:b/>
+      <w:bCs/>
     </w:rPr>
   </w:style>
 </w:styles>
@@ -6550,7 +6854,7 @@
 </file>
 
 <file path=customXml/itemProps1.xml><?xml version="1.0" encoding="utf-8"?>
-<ds:datastoreItem xmlns:ds="http://schemas.openxmlformats.org/officeDocument/2006/customXml" ds:itemID="{8E8CE3BC-B593-4DD7-A919-658157FB5E20}">
+<ds:datastoreItem xmlns:ds="http://schemas.openxmlformats.org/officeDocument/2006/customXml" ds:itemID="{86F8E33F-BD0A-4453-9AAE-0A0D19216537}">
   <ds:schemaRefs>
     <ds:schemaRef ds:uri="http://schemas.openxmlformats.org/officeDocument/2006/bibliography"/>
   </ds:schemaRefs>

</xml_diff>